<commit_message>
Search precision and image search: suggest only documents that really match
- Evidence rule: a document is suggested only if it contains at least one query keyword (or related term) or a
  passage is genuinely relevant in meaning (semantic ranker >= 2.0, or cosine >= 0.45 without the ranker).
  Unrelated documents that vector search always returns, scored about 1-2 by the ranker (25-50%), are hidden.
  Thresholds in Config/search.yaml; the API reports matchedTerms and hiddenNoEvidence.
- Precision filters: minimum match 30%, relative cutoff (60% of the best match), exact-phrase bonus, queries
  naming a code, file name, figure label or quoted phrase only match documents containing it; no padding.
- Image search: images extracted from PDF, Word and Excel are indexed with captions and shown with results.
- Docs and tests updated.

Co-Authored-By: Claude Opus 5.5 <noreply@anthropic.com>
</commit_message>
<xml_diff>
--- a/Data/sample_docs/SM-3-Smart-Meter-Datasheet.docx
+++ b/Data/sample_docs/SM-3-Smart-Meter-Datasheet.docx
@@ -26,6 +26,50 @@
     <w:p>
       <w:r>
         <w:t>The SM-3 is a single-phase smart electricity meter for homes and small shops. It measures energy in both directions, so it supports rooftop solar, and it sends readings to the head-end system every 15 minutes.</w:t>
+      </w:r>
+    </w:p>
+    <w:p>
+      <w:r>
+        <w:drawing>
+          <wp:inline xmlns:a="http://schemas.openxmlformats.org/drawingml/2006/main" xmlns:pic="http://schemas.openxmlformats.org/drawingml/2006/picture">
+            <wp:extent cx="4320000" cy="2304000"/>
+            <wp:docPr id="1" name="Picture 1" descr="Wiring diagram of the SM-3 meter terminals: phase and neutral, supply and load"/>
+            <wp:cNvGraphicFramePr>
+              <a:graphicFrameLocks noChangeAspect="1"/>
+            </wp:cNvGraphicFramePr>
+            <a:graphic>
+              <a:graphicData uri="http://schemas.openxmlformats.org/drawingml/2006/picture">
+                <pic:pic>
+                  <pic:nvPicPr>
+                    <pic:cNvPr id="0" name="sm3-wiring-diagram.png"/>
+                    <pic:cNvPicPr/>
+                  </pic:nvPicPr>
+                  <pic:blipFill>
+                    <a:blip r:embed="rId9"/>
+                    <a:stretch>
+                      <a:fillRect/>
+                    </a:stretch>
+                  </pic:blipFill>
+                  <pic:spPr>
+                    <a:xfrm>
+                      <a:off x="0" y="0"/>
+                      <a:ext cx="4320000" cy="2304000"/>
+                    </a:xfrm>
+                    <a:prstGeom prst="rect"/>
+                  </pic:spPr>
+                </pic:pic>
+              </a:graphicData>
+            </a:graphic>
+          </wp:inline>
+        </w:drawing>
+      </w:r>
+    </w:p>
+    <w:p>
+      <w:pPr>
+        <w:pStyle w:val="Caption"/>
+      </w:pPr>
+      <w:r>
+        <w:t>Figure 1: SM-3 terminal wiring diagram</w:t>
       </w:r>
     </w:p>
     <w:p>

</xml_diff>